<commit_message>
Egy változata a dokumentációnak
Az alap mellett egy kiindulópont, hogy hogyan is nézhetne ki a dokumentáció.
</commit_message>
<xml_diff>
--- a/Dokumentumok/VizsgaRemekDokumentacio(A).docx
+++ b/Dokumentumok/VizsgaRemekDokumentacio(A).docx
@@ -18,6 +18,16 @@
           <w:szCs w:val="36"/>
         </w:rPr>
       </w:pPr>
+      <w:r>
+        <w:rPr>
+          <w:rFonts w:ascii="Arial" w:hAnsi="Arial" w:cs="Arial"/>
+          <w:b/>
+          <w:color w:val="FFFFFF" w:themeColor="background1"/>
+          <w:sz w:val="36"/>
+          <w:szCs w:val="36"/>
+        </w:rPr>
+        <w:br/>
+      </w:r>
       <w:r>
         <w:rPr>
           <w:noProof/>
@@ -150,10 +160,21 @@
         </w:rPr>
         <w:t>Technikum, Szakképző Iskola és Kollégium</w:t>
       </w:r>
+      <w:r>
+        <w:rPr>
+          <w:rFonts w:ascii="Arial" w:hAnsi="Arial" w:cs="Arial"/>
+          <w:b/>
+          <w:color w:val="FFFFFF" w:themeColor="background1"/>
+          <w:sz w:val="36"/>
+          <w:szCs w:val="36"/>
+        </w:rPr>
+        <w:br/>
+      </w:r>
     </w:p>
     <w:p>
       <w:pPr>
         <w:spacing w:after="120"/>
+        <w:jc w:val="center"/>
         <w:rPr>
           <w:color w:val="764CA2"/>
           <w:sz w:val="72"/>
@@ -162,18 +183,19 @@
       </w:pPr>
       <w:r>
         <w:rPr>
+          <w:noProof/>
           <w:color w:val="764CA2"/>
           <w:sz w:val="72"/>
           <w:szCs w:val="72"/>
         </w:rPr>
         <w:drawing>
-          <wp:anchor distT="0" distB="0" distL="114300" distR="114300" simplePos="0" relativeHeight="251661312" behindDoc="0" locked="0" layoutInCell="1" allowOverlap="1" wp14:anchorId="76D0457E" wp14:editId="39898152">
+          <wp:anchor distT="0" distB="0" distL="114300" distR="114300" simplePos="0" relativeHeight="251661312" behindDoc="0" locked="0" layoutInCell="1" allowOverlap="1" wp14:anchorId="76D0457E" wp14:editId="1B7646B5">
             <wp:simplePos x="0" y="0"/>
             <wp:positionH relativeFrom="margin">
-              <wp:posOffset>1730680</wp:posOffset>
+              <wp:posOffset>3599749</wp:posOffset>
             </wp:positionH>
             <wp:positionV relativeFrom="paragraph">
-              <wp:posOffset>612089</wp:posOffset>
+              <wp:posOffset>647956</wp:posOffset>
             </wp:positionV>
             <wp:extent cx="425348" cy="425348"/>
             <wp:effectExtent l="0" t="0" r="0" b="0"/>
@@ -240,14 +262,9 @@
     </w:p>
     <w:p>
       <w:pPr>
-        <w:tabs>
-          <w:tab w:val="left" w:pos="567"/>
-        </w:tabs>
         <w:spacing w:after="800" w:line="720" w:lineRule="auto"/>
-      </w:pPr>
-      <w:r>
-        <w:tab/>
-      </w:r>
+        <w:jc w:val="center"/>
+      </w:pPr>
       <w:hyperlink r:id="rId9" w:history="1">
         <w:r>
           <w:rPr>
@@ -255,29 +272,14 @@
             <w:sz w:val="36"/>
             <w:szCs w:val="36"/>
           </w:rPr>
-          <w:t>villam</w:t>
-        </w:r>
-        <w:r>
-          <w:rPr>
-            <w:rStyle w:val="Hiperhivatkozs"/>
-            <w:sz w:val="36"/>
-            <w:szCs w:val="36"/>
-          </w:rPr>
-          <w:t>m</w:t>
-        </w:r>
-        <w:r>
-          <w:rPr>
-            <w:rStyle w:val="Hiperhivatkozs"/>
-            <w:sz w:val="36"/>
-            <w:szCs w:val="36"/>
-          </w:rPr>
-          <w:t>elo.hu</w:t>
+          <w:t>villammelo.hu</w:t>
         </w:r>
       </w:hyperlink>
     </w:p>
     <w:p>
       <w:pPr>
         <w:spacing w:after="300"/>
+        <w:jc w:val="right"/>
       </w:pPr>
       <w:r>
         <w:t>Készítette:</w:t>
@@ -286,6 +288,7 @@
     <w:p>
       <w:pPr>
         <w:spacing w:after="40"/>
+        <w:jc w:val="right"/>
       </w:pPr>
       <w:r>
         <w:t>Boros Dániel</w:t>
@@ -297,6 +300,7 @@
     <w:p>
       <w:pPr>
         <w:spacing w:after="40"/>
+        <w:jc w:val="right"/>
       </w:pPr>
       <w:proofErr w:type="spellStart"/>
       <w:r>
@@ -311,6 +315,9 @@
       </w:r>
     </w:p>
     <w:p>
+      <w:pPr>
+        <w:jc w:val="right"/>
+      </w:pPr>
       <w:proofErr w:type="spellStart"/>
       <w:r>
         <w:t>Kléber</w:t>
@@ -861,8 +868,6 @@
           <w:fldChar w:fldCharType="end"/>
         </w:r>
       </w:hyperlink>
-      <w:bookmarkStart w:id="0" w:name="_GoBack"/>
-      <w:bookmarkEnd w:id="0"/>
     </w:p>
     <w:p>
       <w:r>
@@ -881,134 +886,135 @@
       <w:pPr>
         <w:pStyle w:val="Cm"/>
       </w:pPr>
-      <w:bookmarkStart w:id="1" w:name="_Toc220930350"/>
-      <w:bookmarkStart w:id="2" w:name="_Toc221019013"/>
+      <w:bookmarkStart w:id="0" w:name="_Toc220930350"/>
+      <w:bookmarkStart w:id="1" w:name="_Toc221019013"/>
       <w:r>
         <w:lastRenderedPageBreak/>
         <w:t>Bevezetés</w:t>
       </w:r>
+      <w:bookmarkEnd w:id="0"/>
       <w:bookmarkEnd w:id="1"/>
+    </w:p>
+    <w:p>
+      <w:pPr>
+        <w:pStyle w:val="Cmsor1"/>
+      </w:pPr>
+      <w:bookmarkStart w:id="2" w:name="_Toc220930351"/>
+      <w:bookmarkStart w:id="3" w:name="_Toc221019014"/>
+      <w:r>
+        <w:t>Témaválasztás indoklása</w:t>
+      </w:r>
       <w:bookmarkEnd w:id="2"/>
+      <w:bookmarkEnd w:id="3"/>
     </w:p>
     <w:p>
       <w:pPr>
         <w:pStyle w:val="Cmsor1"/>
       </w:pPr>
-      <w:bookmarkStart w:id="3" w:name="_Toc220930351"/>
-      <w:bookmarkStart w:id="4" w:name="_Toc221019014"/>
-      <w:r>
-        <w:t>Témaválasztás indoklása</w:t>
-      </w:r>
-      <w:bookmarkEnd w:id="3"/>
+      <w:bookmarkStart w:id="4" w:name="_Toc220930352"/>
+      <w:bookmarkStart w:id="5" w:name="_Toc221019015"/>
+      <w:r>
+        <w:t>Célkitűzés</w:t>
+      </w:r>
       <w:bookmarkEnd w:id="4"/>
-    </w:p>
-    <w:p>
-      <w:pPr>
-        <w:pStyle w:val="Cmsor1"/>
-      </w:pPr>
-      <w:bookmarkStart w:id="5" w:name="_Toc220930352"/>
-      <w:bookmarkStart w:id="6" w:name="_Toc221019015"/>
-      <w:r>
-        <w:t>Célkitűzés</w:t>
-      </w:r>
       <w:bookmarkEnd w:id="5"/>
+    </w:p>
+    <w:p>
+      <w:r>
+        <w:t>A</w:t>
+      </w:r>
+      <w:r>
+        <w:t xml:space="preserve"> célunk</w:t>
+      </w:r>
+      <w:r>
+        <w:t xml:space="preserve"> egyszerű a</w:t>
+      </w:r>
+      <w:r>
+        <w:t xml:space="preserve"> Villám Meló</w:t>
+      </w:r>
+      <w:r>
+        <w:t xml:space="preserve"> weboldallal</w:t>
+      </w:r>
+      <w:r>
+        <w:t>,</w:t>
+      </w:r>
+      <w:r>
+        <w:t xml:space="preserve"> ahogy a nevéből is adódik a gyors munkákra alapszik. A csapatunk ezzel a</w:t>
+      </w:r>
+      <w:r>
+        <w:t>z oldal</w:t>
+      </w:r>
+      <w:r>
+        <w:t xml:space="preserve"> ötlettel szeretné megkönnyíteni az emberek életét, egyaránt azoknak akik munkásokat keresnek és egyaránt a munkát keresőknek is.</w:t>
+      </w:r>
+      <w:r>
+        <w:t xml:space="preserve"> A felhasználóknak akik regisztrálnak illetve belépnek az oldalra </w:t>
+      </w:r>
+      <w:r>
+        <w:t>lehetőséget kapnak</w:t>
+      </w:r>
+      <w:r>
+        <w:t xml:space="preserve"> arra</w:t>
+      </w:r>
+      <w:r>
+        <w:t>, hogy munkákat tudjanak feltölteni, jelentkezni tudjanak mások munkáira és egyéb leírást adni magukról vagy az elvégzendő munkáról. Minden felhasználónak van lehetősége szerkeszteni a profilj</w:t>
+      </w:r>
+      <w:r>
+        <w:t>át amely sok szerkesztési lehetőséget ad.</w:t>
+      </w:r>
+    </w:p>
+    <w:p/>
+    <w:p>
+      <w:pPr>
+        <w:pStyle w:val="Cm"/>
+      </w:pPr>
+      <w:bookmarkStart w:id="6" w:name="_Toc220930353"/>
+      <w:bookmarkStart w:id="7" w:name="_Toc221019016"/>
+      <w:r>
+        <w:t>Fejlesztői dokumentáció</w:t>
+      </w:r>
       <w:bookmarkEnd w:id="6"/>
-    </w:p>
-    <w:p>
-      <w:r>
-        <w:t>A</w:t>
-      </w:r>
-      <w:r>
-        <w:t xml:space="preserve"> célunk</w:t>
-      </w:r>
-      <w:r>
-        <w:t xml:space="preserve"> egyszerű a</w:t>
-      </w:r>
-      <w:r>
-        <w:t xml:space="preserve"> Villám Meló</w:t>
-      </w:r>
-      <w:r>
-        <w:t xml:space="preserve"> weboldallal</w:t>
-      </w:r>
-      <w:r>
-        <w:t>,</w:t>
-      </w:r>
-      <w:r>
-        <w:t xml:space="preserve"> ahogy a nevéből is adódik a gyors munkákra alapszik. A csapatunk ezzel a</w:t>
-      </w:r>
-      <w:r>
-        <w:t>z oldal</w:t>
-      </w:r>
-      <w:r>
-        <w:t xml:space="preserve"> ötlettel szeretné megkönnyíteni az emberek életét, egyaránt azoknak akik munkásokat keresnek és egyaránt a munkát keresőknek is.</w:t>
-      </w:r>
-      <w:r>
-        <w:t xml:space="preserve"> A felhasználóknak akik regisztrálnak illetve belépnek az oldalra </w:t>
-      </w:r>
-      <w:r>
-        <w:t>lehetőséget kapnak</w:t>
-      </w:r>
-      <w:r>
-        <w:t xml:space="preserve"> arra</w:t>
-      </w:r>
-      <w:r>
-        <w:t>, hogy munkákat tudjanak feltölteni, jelentkezni tudjanak mások munkáira és egyéb leírást adni magukról vagy az elvégzendő munkáról. Minden felhasználónak van lehetősége szerkeszteni a profilj</w:t>
-      </w:r>
-      <w:r>
-        <w:t>át amely sok szerkesztési lehetőséget ad.</w:t>
-      </w:r>
-    </w:p>
-    <w:p/>
+      <w:bookmarkEnd w:id="7"/>
+    </w:p>
     <w:p>
       <w:pPr>
         <w:pStyle w:val="Cm"/>
       </w:pPr>
-      <w:bookmarkStart w:id="7" w:name="_Toc220930353"/>
-      <w:bookmarkStart w:id="8" w:name="_Toc221019016"/>
-      <w:r>
-        <w:t>Fejlesztői dokumentáció</w:t>
-      </w:r>
-      <w:bookmarkEnd w:id="7"/>
+      <w:bookmarkStart w:id="8" w:name="_Toc220930354"/>
+      <w:bookmarkStart w:id="9" w:name="_Toc221019017"/>
+      <w:r>
+        <w:t>Felhasználói dokumentáció</w:t>
+      </w:r>
       <w:bookmarkEnd w:id="8"/>
+      <w:bookmarkEnd w:id="9"/>
     </w:p>
     <w:p>
       <w:pPr>
         <w:pStyle w:val="Cm"/>
       </w:pPr>
-      <w:bookmarkStart w:id="9" w:name="_Toc220930354"/>
-      <w:bookmarkStart w:id="10" w:name="_Toc221019017"/>
-      <w:r>
-        <w:t>Felhasználói dokumentáció</w:t>
-      </w:r>
-      <w:bookmarkEnd w:id="9"/>
+      <w:bookmarkStart w:id="10" w:name="_Toc220930355"/>
+      <w:bookmarkStart w:id="11" w:name="_Toc221019018"/>
+      <w:r>
+        <w:t>Összefoglalás</w:t>
+      </w:r>
       <w:bookmarkEnd w:id="10"/>
+      <w:bookmarkEnd w:id="11"/>
     </w:p>
     <w:p>
       <w:pPr>
         <w:pStyle w:val="Cm"/>
       </w:pPr>
-      <w:bookmarkStart w:id="11" w:name="_Toc220930355"/>
-      <w:bookmarkStart w:id="12" w:name="_Toc221019018"/>
-      <w:r>
-        <w:t>Összefoglalás</w:t>
-      </w:r>
-      <w:bookmarkEnd w:id="11"/>
+      <w:bookmarkStart w:id="12" w:name="_Toc220930356"/>
+      <w:bookmarkStart w:id="13" w:name="_Toc221019019"/>
+      <w:r>
+        <w:t>Irodalomjegyzék</w:t>
+      </w:r>
       <w:bookmarkEnd w:id="12"/>
-    </w:p>
-    <w:p>
-      <w:pPr>
-        <w:pStyle w:val="Cm"/>
-      </w:pPr>
-      <w:bookmarkStart w:id="13" w:name="_Toc220930356"/>
-      <w:bookmarkStart w:id="14" w:name="_Toc221019019"/>
-      <w:r>
-        <w:t>Irodalomjegyzék</w:t>
-      </w:r>
       <w:bookmarkEnd w:id="13"/>
-      <w:bookmarkEnd w:id="14"/>
     </w:p>
     <w:sectPr>
       <w:footerReference w:type="default" r:id="rId10"/>
+      <w:footerReference w:type="first" r:id="rId11"/>
       <w:pgSz w:w="11906" w:h="16838"/>
       <w:pgMar w:top="1417" w:right="1417" w:bottom="1417" w:left="1417" w:header="708" w:footer="708" w:gutter="0"/>
       <w:pgBorders w:offsetFrom="page">
@@ -1314,6 +1320,32 @@
       </w:p>
     </w:sdtContent>
   </w:sdt>
+</w:ftr>
+</file>
+
+<file path=word/footer2.xml><?xml version="1.0" encoding="utf-8"?>
+<w:ftr xmlns:wpc="http://schemas.microsoft.com/office/word/2010/wordprocessingCanvas" xmlns:cx="http://schemas.microsoft.com/office/drawing/2014/chartex" xmlns:cx1="http://schemas.microsoft.com/office/drawing/2015/9/8/chartex" xmlns:cx2="http://schemas.microsoft.com/office/drawing/2015/10/21/chartex" xmlns:cx3="http://schemas.microsoft.com/office/drawing/2016/5/9/chartex" xmlns:cx4="http://schemas.microsoft.com/office/drawing/2016/5/10/chartex" xmlns:cx5="http://schemas.microsoft.com/office/drawing/2016/5/11/chartex" xmlns:cx6="http://schemas.microsoft.com/office/drawing/2016/5/12/chartex" xmlns:cx7="http://schemas.microsoft.com/office/drawing/2016/5/13/chartex" xmlns:cx8="http://schemas.microsoft.com/office/drawing/2016/5/14/chartex" xmlns:mc="http://schemas.openxmlformats.org/markup-compatibility/2006" xmlns:aink="http://schemas.microsoft.com/office/drawing/2016/ink" xmlns:am3d="http://schemas.microsoft.com/office/drawing/2017/model3d" xmlns:o="urn:schemas-microsoft-com:office:office" xmlns:r="http://schemas.openxmlformats.org/officeDocument/2006/relationships" xmlns:m="http://schemas.openxmlformats.org/officeDocument/2006/math" xmlns:v="urn:schemas-microsoft-com:vml" xmlns:wp14="http://schemas.microsoft.com/office/word/2010/wordprocessingDrawing" xmlns:wp="http://schemas.openxmlformats.org/drawingml/2006/wordprocessingDrawing" xmlns:w10="urn:schemas-microsoft-com:office:word" xmlns:w="http://schemas.openxmlformats.org/wordprocessingml/2006/main" xmlns:w14="http://schemas.microsoft.com/office/word/2010/wordml" xmlns:w15="http://schemas.microsoft.com/office/word/2012/wordml" xmlns:w16cid="http://schemas.microsoft.com/office/word/2016/wordml/cid" xmlns:w16se="http://schemas.microsoft.com/office/word/2015/wordml/symex" xmlns:wpg="http://schemas.microsoft.com/office/word/2010/wordprocessingGroup" xmlns:wpi="http://schemas.microsoft.com/office/word/2010/wordprocessingInk" xmlns:wne="http://schemas.microsoft.com/office/word/2006/wordml" xmlns:wps="http://schemas.microsoft.com/office/word/2010/wordprocessingShape" mc:Ignorable="w14 w15 w16se w16cid wp14">
+  <w:p>
+    <w:pPr>
+      <w:pStyle w:val="llb"/>
+      <w:rPr>
+        <w:b/>
+      </w:rPr>
+    </w:pPr>
+    <w:r>
+      <w:rPr>
+        <w:b/>
+      </w:rPr>
+      <w:t>Budapest 2025-2026</w:t>
+    </w:r>
+  </w:p>
+  <w:p>
+    <w:pPr>
+      <w:pStyle w:val="llb"/>
+    </w:pPr>
+    <w:bookmarkStart w:id="14" w:name="_GoBack"/>
+    <w:bookmarkEnd w:id="14"/>
+  </w:p>
 </w:ftr>
 </file>
 
@@ -1831,6 +1863,7 @@
   <w:style w:type="character" w:default="1" w:styleId="Bekezdsalapbettpusa">
     <w:name w:val="Default Paragraph Font"/>
     <w:uiPriority w:val="1"/>
+    <w:semiHidden/>
     <w:unhideWhenUsed/>
   </w:style>
   <w:style w:type="table" w:default="1" w:styleId="Normltblzat">
@@ -2406,7 +2439,7 @@
 </file>
 
 <file path=customXml/itemProps1.xml><?xml version="1.0" encoding="utf-8"?>
-<ds:datastoreItem xmlns:ds="http://schemas.openxmlformats.org/officeDocument/2006/customXml" ds:itemID="{000A9ED6-1A36-4094-BE2F-B2670BDC6C27}">
+<ds:datastoreItem xmlns:ds="http://schemas.openxmlformats.org/officeDocument/2006/customXml" ds:itemID="{AF5BE1CD-4D9E-4FAD-B1BA-72C22F046A55}">
   <ds:schemaRefs>
     <ds:schemaRef ds:uri="http://schemas.openxmlformats.org/officeDocument/2006/bibliography"/>
   </ds:schemaRefs>

</xml_diff>